<commit_message>
:books: docs: Documentação classes de erro
</commit_message>
<xml_diff>
--- a/Documents/Documents/Sprint11_Task145_Implementação_de_validações_padronizações_position.docx
+++ b/Documents/Documents/Sprint11_Task145_Implementação_de_validações_padronizações_position.docx
@@ -4,6 +4,7 @@
   <w:body>
     <w:p>
       <w:pPr>
+        <w:ind w:left="708"/>
         <w:jc w:val="center"/>
       </w:pPr>
       <w:r>
@@ -67,6 +68,7 @@
       <w:tblPr>
         <w:tblStyle w:val="Tabelacomgrade"/>
         <w:tblW w:w="10201" w:type="dxa"/>
+        <w:tblInd w:w="708" w:type="dxa"/>
         <w:tblLook w:val="04A0" w:firstRow="1" w:lastRow="0" w:firstColumn="1" w:lastColumn="0" w:noHBand="0" w:noVBand="1"/>
       </w:tblPr>
       <w:tblGrid>
@@ -467,11 +469,16 @@
         </w:tc>
       </w:tr>
     </w:tbl>
-    <w:p/>
+    <w:p>
+      <w:pPr>
+        <w:ind w:left="708"/>
+      </w:pPr>
+    </w:p>
     <w:tbl>
       <w:tblPr>
         <w:tblStyle w:val="Tabelacomgrade"/>
         <w:tblW w:w="10201" w:type="dxa"/>
+        <w:tblInd w:w="708" w:type="dxa"/>
         <w:tblLook w:val="04A0" w:firstRow="1" w:lastRow="0" w:firstColumn="1" w:lastColumn="0" w:noHBand="0" w:noVBand="1"/>
       </w:tblPr>
       <w:tblGrid>
@@ -713,11 +720,16 @@
         </w:tc>
       </w:tr>
     </w:tbl>
-    <w:p/>
+    <w:p>
+      <w:pPr>
+        <w:ind w:left="708"/>
+      </w:pPr>
+    </w:p>
     <w:tbl>
       <w:tblPr>
         <w:tblStyle w:val="Tabelacomgrade"/>
-        <w:tblW w:w="0" w:type="auto"/>
+        <w:tblW w:w="10183" w:type="dxa"/>
+        <w:tblInd w:w="708" w:type="dxa"/>
         <w:tblLook w:val="04A0" w:firstRow="1" w:lastRow="0" w:firstColumn="1" w:lastColumn="0" w:noHBand="0" w:noVBand="1"/>
       </w:tblPr>
       <w:tblGrid>
@@ -970,11 +982,16 @@
         </w:tc>
       </w:tr>
     </w:tbl>
-    <w:p/>
+    <w:p>
+      <w:pPr>
+        <w:ind w:left="708"/>
+      </w:pPr>
+    </w:p>
     <w:tbl>
       <w:tblPr>
         <w:tblStyle w:val="Tabelacomgrade"/>
-        <w:tblW w:w="0" w:type="auto"/>
+        <w:tblW w:w="10183" w:type="dxa"/>
+        <w:tblInd w:w="708" w:type="dxa"/>
         <w:tblLook w:val="04A0" w:firstRow="1" w:lastRow="0" w:firstColumn="1" w:lastColumn="0" w:noHBand="0" w:noVBand="1"/>
       </w:tblPr>
       <w:tblGrid>
@@ -1022,53 +1039,124 @@
         </w:tc>
       </w:tr>
     </w:tbl>
-    <w:p/>
     <w:p>
-      <w:r>
-        <w:t xml:space="preserve">Foi definido um padrão para </w:t>
-      </w:r>
-      <w:r>
-        <w:t>retorno de resposta, erros, autenticação nas rotas, versionamento das rotas e correções de tamanho de campo e validar delete.</w:t>
-      </w:r>
+      <w:pPr>
+        <w:ind w:left="708"/>
+      </w:pPr>
     </w:p>
     <w:p>
-      <w:r>
-        <w:t xml:space="preserve">Padrão de resposta é </w:t>
-      </w:r>
-      <w:r>
-        <w:t>um padrão para o tratamento de erros da API, garantindo consistência e clareza nas respostas enviadas ao cliente. Esse padrão estabelece a forma como os erros são estruturados, incluindo informações como código de status HTTP, código interno da aplicação, mensagem descritiva e, quando aplicável, detalhes adicionais para auxiliar no diagnóstico do problema. Dessa forma, os consumidores da API conseguem identificar rapidamente a causa do erro e aplicar as devidas correções, além de facilitar o monitoramento e a manutenção do sistema.</w:t>
+      <w:pPr>
+        <w:ind w:left="708"/>
+      </w:pPr>
+      <w:r>
+        <w:t xml:space="preserve">Foi definido um padrão para </w:t>
+      </w:r>
+      <w:r>
+        <w:t>retorno de resposta, erros, autenticação nas rotas, versionamento das rotas e correções de tamanho de campo e validar delete.</w:t>
       </w:r>
     </w:p>
     <w:p>
-      <w:r>
-        <w:t xml:space="preserve">Além disso, houve uma redução e simplificação significativa da quantidade de código presente na </w:t>
-      </w:r>
-      <w:proofErr w:type="spellStart"/>
-      <w:r>
-        <w:t>Controller</w:t>
-      </w:r>
-      <w:proofErr w:type="spellEnd"/>
-      <w:r>
-        <w:t xml:space="preserve"> de position</w:t>
-      </w:r>
-      <w:r>
-        <w:t xml:space="preserve">. Essa melhoria foi alcançada por meio da padronização de respostas, reutilização de componentes comuns e centralização das regras de tratamento de erros e validações. Como resultado, as </w:t>
-      </w:r>
-      <w:proofErr w:type="spellStart"/>
-      <w:r>
-        <w:t>Controllers</w:t>
-      </w:r>
-      <w:proofErr w:type="spellEnd"/>
-      <w:r>
-        <w:t xml:space="preserve"> ficaram mais enxutas, de fácil manutenção, tornando o código mais legível, escalável e menos propenso a falhas</w:t>
+      <w:pPr>
+        <w:ind w:left="708"/>
+      </w:pPr>
+      <w:r>
+        <w:t xml:space="preserve">Padrão de resposta é </w:t>
+      </w:r>
+      <w:r>
+        <w:t>um padrão para o tratamento de erros da API, garantindo consistência e clareza nas respostas enviadas ao cliente. Esse padrão estabelece a forma como os erros são estruturados, incluindo informações como código de status HTTP, código interno da aplicação, mensagem descritiva e, quando aplicável, detalhes adicionais para auxiliar no diagnóstico do problema. Dessa forma, os consumidores da API conseguem identificar rapidamente a causa do erro e aplicar as devidas correções, além de facilitar o monitoramento e a manutenção do sistema.</w:t>
       </w:r>
     </w:p>
     <w:p>
+      <w:pPr>
+        <w:ind w:left="708"/>
+      </w:pPr>
+      <w:r>
+        <w:t xml:space="preserve">Além disso, houve uma redução e simplificação significativa da quantidade de código presente na </w:t>
+      </w:r>
+      <w:proofErr w:type="spellStart"/>
+      <w:r>
+        <w:t>Controller</w:t>
+      </w:r>
+      <w:proofErr w:type="spellEnd"/>
+      <w:r>
+        <w:t xml:space="preserve"> de position</w:t>
+      </w:r>
+      <w:r>
+        <w:t xml:space="preserve">. Essa melhoria foi alcançada por meio da padronização de respostas, reutilização de componentes comuns e centralização das regras de tratamento de erros e validações. Como resultado, as </w:t>
+      </w:r>
+      <w:proofErr w:type="spellStart"/>
+      <w:r>
+        <w:t>Controllers</w:t>
+      </w:r>
+      <w:proofErr w:type="spellEnd"/>
+      <w:r>
+        <w:t xml:space="preserve"> ficaram mais enxutas, de fácil manutenção, tornando o código mais legível, escalável e menos propenso a falhas</w:t>
+      </w:r>
+      <w:r>
+        <w:t xml:space="preserve"> com as classes de erro:</w:t>
+      </w:r>
+    </w:p>
+    <w:p>
+      <w:pPr>
+        <w:ind w:left="708"/>
+      </w:pPr>
+      <w:bookmarkStart w:id="0" w:name="_GoBack"/>
+      <w:bookmarkEnd w:id="0"/>
+      <w:proofErr w:type="spellStart"/>
+      <w:r>
+        <w:t>ExceptionBadRequest.cs</w:t>
+      </w:r>
+      <w:proofErr w:type="spellEnd"/>
+    </w:p>
+    <w:p>
+      <w:pPr>
+        <w:ind w:left="708"/>
+      </w:pPr>
+      <w:proofErr w:type="spellStart"/>
+      <w:r>
+        <w:t>ExceptionConflict.cs</w:t>
+      </w:r>
+      <w:proofErr w:type="spellEnd"/>
+    </w:p>
+    <w:p>
+      <w:pPr>
+        <w:ind w:left="708"/>
+      </w:pPr>
+      <w:proofErr w:type="spellStart"/>
+      <w:r>
+        <w:t>ExceptionForbidden.cs</w:t>
+      </w:r>
+      <w:proofErr w:type="spellEnd"/>
+    </w:p>
+    <w:p>
+      <w:pPr>
+        <w:ind w:left="708"/>
+      </w:pPr>
+      <w:proofErr w:type="spellStart"/>
+      <w:r>
+        <w:t>ExceptionNotFound.cs</w:t>
+      </w:r>
+      <w:proofErr w:type="spellEnd"/>
+    </w:p>
+    <w:p>
+      <w:pPr>
+        <w:ind w:left="708"/>
+      </w:pPr>
+      <w:proofErr w:type="spellStart"/>
+      <w:r>
+        <w:lastRenderedPageBreak/>
+        <w:t>ExceptionUnauthorized.cs</w:t>
+      </w:r>
+      <w:proofErr w:type="spellEnd"/>
+    </w:p>
+    <w:p>
+      <w:pPr>
+        <w:ind w:left="708"/>
+      </w:pPr>
       <w:r>
         <w:rPr>
           <w:noProof/>
         </w:rPr>
-        <w:lastRenderedPageBreak/>
         <w:drawing>
           <wp:inline distT="0" distB="0" distL="0" distR="0" wp14:anchorId="29EAA8CB" wp14:editId="2A5A3709">
             <wp:extent cx="3524742" cy="2543530"/>
@@ -1107,6 +1195,9 @@
       </w:r>
     </w:p>
     <w:p>
+      <w:pPr>
+        <w:ind w:left="708"/>
+      </w:pPr>
       <w:r>
         <w:rPr>
           <w:noProof/>
@@ -1148,8 +1239,15 @@
         </w:drawing>
       </w:r>
     </w:p>
-    <w:p/>
     <w:p>
+      <w:pPr>
+        <w:ind w:left="708"/>
+      </w:pPr>
+    </w:p>
+    <w:p>
+      <w:pPr>
+        <w:ind w:left="708"/>
+      </w:pPr>
       <w:r>
         <w:t>A</w:t>
       </w:r>
@@ -1181,6 +1279,9 @@
       </w:r>
     </w:p>
     <w:p>
+      <w:pPr>
+        <w:ind w:left="708"/>
+      </w:pPr>
       <w:r>
         <w:t xml:space="preserve">"API Atualizada: Implementada Autenticação JWT completa para proteger </w:t>
       </w:r>
@@ -1219,6 +1320,9 @@
       </w:r>
     </w:p>
     <w:p>
+      <w:pPr>
+        <w:ind w:left="708"/>
+      </w:pPr>
       <w:r>
         <w:t xml:space="preserve">Ação: Permite que apenas usuários com um </w:t>
       </w:r>
@@ -1232,11 +1336,17 @@
       </w:r>
     </w:p>
     <w:p>
+      <w:pPr>
+        <w:ind w:left="708"/>
+      </w:pPr>
       <w:r>
         <w:t>"Métodos de validação foram revisados para padronizar retornos de erro (4xx/5xx)."</w:t>
       </w:r>
     </w:p>
     <w:p>
+      <w:pPr>
+        <w:ind w:left="708"/>
+      </w:pPr>
       <w:r>
         <w:t xml:space="preserve">"As rotas foram </w:t>
       </w:r>
@@ -1258,6 +1368,9 @@
       </w:r>
     </w:p>
     <w:p>
+      <w:pPr>
+        <w:ind w:left="708"/>
+      </w:pPr>
       <w:r>
         <w:t>Uso de [</w:t>
       </w:r>
@@ -1312,10 +1425,11 @@
       <w:r>
         <w:t>/v2/).</w:t>
       </w:r>
-      <w:bookmarkStart w:id="0" w:name="_GoBack"/>
-      <w:bookmarkEnd w:id="0"/>
     </w:p>
     <w:p>
+      <w:pPr>
+        <w:ind w:left="708"/>
+      </w:pPr>
       <w:r>
         <w:t xml:space="preserve">A proteção via JWT (ponto 1) é aplicada nas </w:t>
       </w:r>
@@ -1337,6 +1451,9 @@
       </w:r>
     </w:p>
     <w:p>
+      <w:pPr>
+        <w:ind w:left="708"/>
+      </w:pPr>
       <w:r>
         <w:rPr>
           <w:noProof/>
@@ -1379,6 +1496,9 @@
       </w:r>
     </w:p>
     <w:p>
+      <w:pPr>
+        <w:ind w:left="708"/>
+      </w:pPr>
       <w:r>
         <w:t xml:space="preserve">Correções na validação de tamanho no campo de </w:t>
       </w:r>
@@ -1425,6 +1545,9 @@
       </w:r>
     </w:p>
     <w:p>
+      <w:pPr>
+        <w:ind w:left="708"/>
+      </w:pPr>
       <w:r>
         <w:rPr>
           <w:noProof/>
@@ -4287,6 +4410,21 @@
 </file>
 
 <file path=customXml/item1.xml><?xml version="1.0" encoding="utf-8"?>
+<p:properties xmlns:p="http://schemas.microsoft.com/office/2006/metadata/properties" xmlns:xsi="http://www.w3.org/2001/XMLSchema-instance" xmlns:pc="http://schemas.microsoft.com/office/infopath/2007/PartnerControls">
+  <documentManagement/>
+</p:properties>
+</file>
+
+<file path=customXml/item2.xml><?xml version="1.0" encoding="utf-8"?>
+<?mso-contentType ?>
+<FormTemplates xmlns="http://schemas.microsoft.com/sharepoint/v3/contenttype/forms">
+  <Display>DocumentLibraryForm</Display>
+  <Edit>DocumentLibraryForm</Edit>
+  <New>DocumentLibraryForm</New>
+</FormTemplates>
+</file>
+
+<file path=customXml/item3.xml><?xml version="1.0" encoding="utf-8"?>
 <ct:contentTypeSchema xmlns:ct="http://schemas.microsoft.com/office/2006/metadata/contentType" xmlns:ma="http://schemas.microsoft.com/office/2006/metadata/properties/metaAttributes" ct:_="" ma:_="" ma:contentTypeName="Documento" ma:contentTypeID="0x010100B37008164333CE47B7554A23BF4CE40A" ma:contentTypeVersion="3" ma:contentTypeDescription="Crie um novo documento." ma:contentTypeScope="" ma:versionID="01d70e1db2e5282cbeb036b3d8462683">
   <xsd:schema xmlns:xsd="http://www.w3.org/2001/XMLSchema" xmlns:xs="http://www.w3.org/2001/XMLSchema" xmlns:p="http://schemas.microsoft.com/office/2006/metadata/properties" xmlns:ns2="0dd540f2-19ea-4199-a9ce-e531162f98d7" targetNamespace="http://schemas.microsoft.com/office/2006/metadata/properties" ma:root="true" ma:fieldsID="b0ca1735cf6dfdacfbf35c674503d2b1" ns2:_="">
     <xsd:import namespace="0dd540f2-19ea-4199-a9ce-e531162f98d7"/>
@@ -4424,22 +4562,24 @@
 </ct:contentTypeSchema>
 </file>
 
-<file path=customXml/item2.xml><?xml version="1.0" encoding="utf-8"?>
-<?mso-contentType ?>
-<FormTemplates xmlns="http://schemas.microsoft.com/sharepoint/v3/contenttype/forms">
-  <Display>DocumentLibraryForm</Display>
-  <Edit>DocumentLibraryForm</Edit>
-  <New>DocumentLibraryForm</New>
-</FormTemplates>
+<file path=customXml/itemProps1.xml><?xml version="1.0" encoding="utf-8"?>
+<ds:datastoreItem xmlns:ds="http://schemas.openxmlformats.org/officeDocument/2006/customXml" ds:itemID="{0028EFB7-3706-477C-BC22-76AF0C752638}">
+  <ds:schemaRefs>
+    <ds:schemaRef ds:uri="http://schemas.microsoft.com/office/2006/metadata/properties"/>
+    <ds:schemaRef ds:uri="http://schemas.microsoft.com/office/infopath/2007/PartnerControls"/>
+  </ds:schemaRefs>
+</ds:datastoreItem>
 </file>
 
-<file path=customXml/item3.xml><?xml version="1.0" encoding="utf-8"?>
-<p:properties xmlns:p="http://schemas.microsoft.com/office/2006/metadata/properties" xmlns:xsi="http://www.w3.org/2001/XMLSchema-instance" xmlns:pc="http://schemas.microsoft.com/office/infopath/2007/PartnerControls">
-  <documentManagement/>
-</p:properties>
+<file path=customXml/itemProps2.xml><?xml version="1.0" encoding="utf-8"?>
+<ds:datastoreItem xmlns:ds="http://schemas.openxmlformats.org/officeDocument/2006/customXml" ds:itemID="{0876BD9A-9CA5-48C2-BF8E-F2DECFB0FD38}">
+  <ds:schemaRefs>
+    <ds:schemaRef ds:uri="http://schemas.microsoft.com/sharepoint/v3/contenttype/forms"/>
+  </ds:schemaRefs>
+</ds:datastoreItem>
 </file>
 
-<file path=customXml/itemProps1.xml><?xml version="1.0" encoding="utf-8"?>
+<file path=customXml/itemProps3.xml><?xml version="1.0" encoding="utf-8"?>
 <ds:datastoreItem xmlns:ds="http://schemas.openxmlformats.org/officeDocument/2006/customXml" ds:itemID="{3258D31E-C4C0-4BAE-8DEF-91B5992C0A3A}">
   <ds:schemaRefs>
     <ds:schemaRef ds:uri="http://schemas.microsoft.com/office/2006/metadata/contentType"/>
@@ -4455,21 +4595,4 @@
     <ds:schemaRef ds:uri="http://schemas.microsoft.com/internal/obd"/>
   </ds:schemaRefs>
 </ds:datastoreItem>
-</file>
-
-<file path=customXml/itemProps2.xml><?xml version="1.0" encoding="utf-8"?>
-<ds:datastoreItem xmlns:ds="http://schemas.openxmlformats.org/officeDocument/2006/customXml" ds:itemID="{0876BD9A-9CA5-48C2-BF8E-F2DECFB0FD38}">
-  <ds:schemaRefs>
-    <ds:schemaRef ds:uri="http://schemas.microsoft.com/sharepoint/v3/contenttype/forms"/>
-  </ds:schemaRefs>
-</ds:datastoreItem>
-</file>
-
-<file path=customXml/itemProps3.xml><?xml version="1.0" encoding="utf-8"?>
-<ds:datastoreItem xmlns:ds="http://schemas.openxmlformats.org/officeDocument/2006/customXml" ds:itemID="{0028EFB7-3706-477C-BC22-76AF0C752638}">
-  <ds:schemaRefs>
-    <ds:schemaRef ds:uri="http://schemas.microsoft.com/office/2006/metadata/properties"/>
-    <ds:schemaRef ds:uri="http://schemas.microsoft.com/office/infopath/2007/PartnerControls"/>
-  </ds:schemaRefs>
-</ds:datastoreItem>
 </file>
</xml_diff>

<commit_message>
:books: docs: Documentação atualizando horas
</commit_message>
<xml_diff>
--- a/Documents/Documents/Sprint11_Task145_Implementação_de_validações_padronizações_position.docx
+++ b/Documents/Documents/Sprint11_Task145_Implementação_de_validações_padronizações_position.docx
@@ -67,19 +67,19 @@
     <w:tbl>
       <w:tblPr>
         <w:tblStyle w:val="Tabelacomgrade"/>
-        <w:tblW w:w="10201" w:type="dxa"/>
+        <w:tblW w:w="9493" w:type="dxa"/>
         <w:tblInd w:w="708" w:type="dxa"/>
         <w:tblLook w:val="04A0" w:firstRow="1" w:lastRow="0" w:firstColumn="1" w:lastColumn="0" w:noHBand="0" w:noVBand="1"/>
       </w:tblPr>
       <w:tblGrid>
         <w:gridCol w:w="2754"/>
         <w:gridCol w:w="2754"/>
-        <w:gridCol w:w="4693"/>
+        <w:gridCol w:w="3985"/>
       </w:tblGrid>
       <w:tr>
         <w:tc>
           <w:tcPr>
-            <w:tcW w:w="10201" w:type="dxa"/>
+            <w:tcW w:w="9493" w:type="dxa"/>
             <w:gridSpan w:val="3"/>
             <w:shd w:val="clear" w:color="auto" w:fill="000000" w:themeFill="text1"/>
           </w:tcPr>
@@ -199,7 +199,7 @@
         </w:tc>
         <w:tc>
           <w:tcPr>
-            <w:tcW w:w="4693" w:type="dxa"/>
+            <w:tcW w:w="3985" w:type="dxa"/>
           </w:tcPr>
           <w:p>
             <w:pPr>
@@ -306,7 +306,7 @@
         </w:tc>
         <w:tc>
           <w:tcPr>
-            <w:tcW w:w="7447" w:type="dxa"/>
+            <w:tcW w:w="6739" w:type="dxa"/>
             <w:gridSpan w:val="2"/>
           </w:tcPr>
           <w:p>
@@ -358,7 +358,7 @@
         </w:tc>
         <w:tc>
           <w:tcPr>
-            <w:tcW w:w="7447" w:type="dxa"/>
+            <w:tcW w:w="6739" w:type="dxa"/>
             <w:gridSpan w:val="2"/>
           </w:tcPr>
           <w:p>
@@ -381,7 +381,7 @@
       <w:tr>
         <w:tc>
           <w:tcPr>
-            <w:tcW w:w="10201" w:type="dxa"/>
+            <w:tcW w:w="9493" w:type="dxa"/>
             <w:gridSpan w:val="3"/>
             <w:shd w:val="clear" w:color="auto" w:fill="000000" w:themeFill="text1"/>
           </w:tcPr>
@@ -417,7 +417,7 @@
       <w:tr>
         <w:tc>
           <w:tcPr>
-            <w:tcW w:w="10201" w:type="dxa"/>
+            <w:tcW w:w="9493" w:type="dxa"/>
             <w:gridSpan w:val="3"/>
           </w:tcPr>
           <w:p>
@@ -435,7 +435,7 @@
       <w:tr>
         <w:tc>
           <w:tcPr>
-            <w:tcW w:w="10201" w:type="dxa"/>
+            <w:tcW w:w="9493" w:type="dxa"/>
             <w:gridSpan w:val="3"/>
           </w:tcPr>
           <w:p/>
@@ -444,7 +444,7 @@
       <w:tr>
         <w:tc>
           <w:tcPr>
-            <w:tcW w:w="10201" w:type="dxa"/>
+            <w:tcW w:w="9493" w:type="dxa"/>
             <w:gridSpan w:val="3"/>
           </w:tcPr>
           <w:p/>
@@ -453,7 +453,7 @@
       <w:tr>
         <w:tc>
           <w:tcPr>
-            <w:tcW w:w="10201" w:type="dxa"/>
+            <w:tcW w:w="9493" w:type="dxa"/>
             <w:gridSpan w:val="3"/>
           </w:tcPr>
           <w:p/>
@@ -462,7 +462,7 @@
       <w:tr>
         <w:tc>
           <w:tcPr>
-            <w:tcW w:w="10201" w:type="dxa"/>
+            <w:tcW w:w="9493" w:type="dxa"/>
             <w:gridSpan w:val="3"/>
           </w:tcPr>
           <w:p/>
@@ -477,20 +477,20 @@
     <w:tbl>
       <w:tblPr>
         <w:tblStyle w:val="Tabelacomgrade"/>
-        <w:tblW w:w="10201" w:type="dxa"/>
+        <w:tblW w:w="9493" w:type="dxa"/>
         <w:tblInd w:w="708" w:type="dxa"/>
         <w:tblLook w:val="04A0" w:firstRow="1" w:lastRow="0" w:firstColumn="1" w:lastColumn="0" w:noHBand="0" w:noVBand="1"/>
       </w:tblPr>
       <w:tblGrid>
-        <w:gridCol w:w="754"/>
-        <w:gridCol w:w="6234"/>
-        <w:gridCol w:w="1541"/>
-        <w:gridCol w:w="1672"/>
+        <w:gridCol w:w="751"/>
+        <w:gridCol w:w="5940"/>
+        <w:gridCol w:w="1524"/>
+        <w:gridCol w:w="1278"/>
       </w:tblGrid>
       <w:tr>
         <w:tc>
           <w:tcPr>
-            <w:tcW w:w="10201" w:type="dxa"/>
+            <w:tcW w:w="9493" w:type="dxa"/>
             <w:gridSpan w:val="4"/>
             <w:shd w:val="clear" w:color="auto" w:fill="000000" w:themeFill="text1"/>
           </w:tcPr>
@@ -530,7 +530,7 @@
         </w:tc>
         <w:tc>
           <w:tcPr>
-            <w:tcW w:w="6234" w:type="dxa"/>
+            <w:tcW w:w="6225" w:type="dxa"/>
           </w:tcPr>
           <w:p>
             <w:proofErr w:type="spellStart"/>
@@ -542,7 +542,7 @@
         </w:tc>
         <w:tc>
           <w:tcPr>
-            <w:tcW w:w="1541" w:type="dxa"/>
+            <w:tcW w:w="1540" w:type="dxa"/>
           </w:tcPr>
           <w:p>
             <w:r>
@@ -552,7 +552,7 @@
         </w:tc>
         <w:tc>
           <w:tcPr>
-            <w:tcW w:w="1672" w:type="dxa"/>
+            <w:tcW w:w="974" w:type="dxa"/>
           </w:tcPr>
           <w:p>
             <w:r>
@@ -577,7 +577,7 @@
         </w:tc>
         <w:tc>
           <w:tcPr>
-            <w:tcW w:w="6234" w:type="dxa"/>
+            <w:tcW w:w="6225" w:type="dxa"/>
           </w:tcPr>
           <w:p>
             <w:r>
@@ -596,7 +596,7 @@
         </w:tc>
         <w:tc>
           <w:tcPr>
-            <w:tcW w:w="1541" w:type="dxa"/>
+            <w:tcW w:w="1540" w:type="dxa"/>
           </w:tcPr>
           <w:p>
             <w:pPr>
@@ -626,7 +626,7 @@
         </w:tc>
         <w:tc>
           <w:tcPr>
-            <w:tcW w:w="1672" w:type="dxa"/>
+            <w:tcW w:w="974" w:type="dxa"/>
           </w:tcPr>
           <w:p>
             <w:r>
@@ -650,19 +650,19 @@
         </w:tc>
         <w:tc>
           <w:tcPr>
-            <w:tcW w:w="6234" w:type="dxa"/>
+            <w:tcW w:w="6225" w:type="dxa"/>
           </w:tcPr>
           <w:p/>
         </w:tc>
         <w:tc>
           <w:tcPr>
-            <w:tcW w:w="1541" w:type="dxa"/>
+            <w:tcW w:w="1540" w:type="dxa"/>
           </w:tcPr>
           <w:p/>
         </w:tc>
         <w:tc>
           <w:tcPr>
-            <w:tcW w:w="1672" w:type="dxa"/>
+            <w:tcW w:w="974" w:type="dxa"/>
           </w:tcPr>
           <w:p/>
         </w:tc>
@@ -676,19 +676,19 @@
         </w:tc>
         <w:tc>
           <w:tcPr>
-            <w:tcW w:w="6234" w:type="dxa"/>
+            <w:tcW w:w="6225" w:type="dxa"/>
           </w:tcPr>
           <w:p/>
         </w:tc>
         <w:tc>
           <w:tcPr>
-            <w:tcW w:w="1541" w:type="dxa"/>
+            <w:tcW w:w="1540" w:type="dxa"/>
           </w:tcPr>
           <w:p/>
         </w:tc>
         <w:tc>
           <w:tcPr>
-            <w:tcW w:w="1672" w:type="dxa"/>
+            <w:tcW w:w="974" w:type="dxa"/>
           </w:tcPr>
           <w:p/>
         </w:tc>
@@ -702,19 +702,19 @@
         </w:tc>
         <w:tc>
           <w:tcPr>
-            <w:tcW w:w="6234" w:type="dxa"/>
+            <w:tcW w:w="6225" w:type="dxa"/>
           </w:tcPr>
           <w:p/>
         </w:tc>
         <w:tc>
           <w:tcPr>
-            <w:tcW w:w="1541" w:type="dxa"/>
+            <w:tcW w:w="1540" w:type="dxa"/>
           </w:tcPr>
           <w:p/>
         </w:tc>
         <w:tc>
           <w:tcPr>
-            <w:tcW w:w="1672" w:type="dxa"/>
+            <w:tcW w:w="974" w:type="dxa"/>
           </w:tcPr>
           <w:p/>
         </w:tc>
@@ -728,7 +728,7 @@
     <w:tbl>
       <w:tblPr>
         <w:tblStyle w:val="Tabelacomgrade"/>
-        <w:tblW w:w="10183" w:type="dxa"/>
+        <w:tblW w:w="9493" w:type="dxa"/>
         <w:tblInd w:w="708" w:type="dxa"/>
         <w:tblLook w:val="04A0" w:firstRow="1" w:lastRow="0" w:firstColumn="1" w:lastColumn="0" w:noHBand="0" w:noVBand="1"/>
       </w:tblPr>
@@ -738,12 +738,12 @@
         <w:gridCol w:w="1441"/>
         <w:gridCol w:w="1418"/>
         <w:gridCol w:w="1842"/>
-        <w:gridCol w:w="1683"/>
+        <w:gridCol w:w="993"/>
       </w:tblGrid>
       <w:tr>
         <w:tc>
           <w:tcPr>
-            <w:tcW w:w="10183" w:type="dxa"/>
+            <w:tcW w:w="9493" w:type="dxa"/>
             <w:gridSpan w:val="6"/>
             <w:shd w:val="clear" w:color="auto" w:fill="000000" w:themeFill="text1"/>
           </w:tcPr>
@@ -858,7 +858,7 @@
         </w:tc>
         <w:tc>
           <w:tcPr>
-            <w:tcW w:w="1683" w:type="dxa"/>
+            <w:tcW w:w="993" w:type="dxa"/>
           </w:tcPr>
           <w:p>
             <w:proofErr w:type="spellStart"/>
@@ -928,17 +928,22 @@
           </w:tcPr>
           <w:p>
             <w:r>
-              <w:t>15</w:t>
+              <w:t>20</w:t>
             </w:r>
           </w:p>
         </w:tc>
         <w:tc>
           <w:tcPr>
-            <w:tcW w:w="1683" w:type="dxa"/>
+            <w:tcW w:w="993" w:type="dxa"/>
           </w:tcPr>
           <w:p>
             <w:r>
-              <w:t xml:space="preserve">15 </w:t>
+              <w:t>20</w:t>
+            </w:r>
+            <w:bookmarkStart w:id="0" w:name="_GoBack"/>
+            <w:bookmarkEnd w:id="0"/>
+            <w:r>
+              <w:t xml:space="preserve"> </w:t>
             </w:r>
           </w:p>
         </w:tc>
@@ -976,7 +981,7 @@
         </w:tc>
         <w:tc>
           <w:tcPr>
-            <w:tcW w:w="1683" w:type="dxa"/>
+            <w:tcW w:w="993" w:type="dxa"/>
           </w:tcPr>
           <w:p/>
         </w:tc>
@@ -990,17 +995,17 @@
     <w:tbl>
       <w:tblPr>
         <w:tblStyle w:val="Tabelacomgrade"/>
-        <w:tblW w:w="10183" w:type="dxa"/>
+        <w:tblW w:w="9493" w:type="dxa"/>
         <w:tblInd w:w="708" w:type="dxa"/>
         <w:tblLook w:val="04A0" w:firstRow="1" w:lastRow="0" w:firstColumn="1" w:lastColumn="0" w:noHBand="0" w:noVBand="1"/>
       </w:tblPr>
       <w:tblGrid>
-        <w:gridCol w:w="10183"/>
+        <w:gridCol w:w="9493"/>
       </w:tblGrid>
       <w:tr>
         <w:tc>
           <w:tcPr>
-            <w:tcW w:w="10183" w:type="dxa"/>
+            <w:tcW w:w="9493" w:type="dxa"/>
             <w:shd w:val="clear" w:color="auto" w:fill="000000" w:themeFill="text1"/>
           </w:tcPr>
           <w:p>
@@ -1047,6 +1052,7 @@
     <w:p>
       <w:pPr>
         <w:ind w:left="708"/>
+        <w:jc w:val="both"/>
       </w:pPr>
       <w:r>
         <w:t xml:space="preserve">Foi definido um padrão para </w:t>
@@ -1058,6 +1064,7 @@
     <w:p>
       <w:pPr>
         <w:ind w:left="708"/>
+        <w:jc w:val="both"/>
       </w:pPr>
       <w:r>
         <w:t xml:space="preserve">Padrão de resposta é </w:t>
@@ -1069,6 +1076,7 @@
     <w:p>
       <w:pPr>
         <w:ind w:left="708"/>
+        <w:jc w:val="both"/>
       </w:pPr>
       <w:r>
         <w:t xml:space="preserve">Além disso, houve uma redução e simplificação significativa da quantidade de código presente na </w:t>
@@ -1100,8 +1108,6 @@
       <w:pPr>
         <w:ind w:left="708"/>
       </w:pPr>
-      <w:bookmarkStart w:id="0" w:name="_GoBack"/>
-      <w:bookmarkEnd w:id="0"/>
       <w:proofErr w:type="spellStart"/>
       <w:r>
         <w:t>ExceptionBadRequest.cs</w:t>
@@ -1134,6 +1140,7 @@
       </w:pPr>
       <w:proofErr w:type="spellStart"/>
       <w:r>
+        <w:lastRenderedPageBreak/>
         <w:t>ExceptionNotFound.cs</w:t>
       </w:r>
       <w:proofErr w:type="spellEnd"/>
@@ -1144,7 +1151,6 @@
       </w:pPr>
       <w:proofErr w:type="spellStart"/>
       <w:r>
-        <w:lastRenderedPageBreak/>
         <w:t>ExceptionUnauthorized.cs</w:t>
       </w:r>
       <w:proofErr w:type="spellEnd"/>
@@ -1247,6 +1253,7 @@
     <w:p>
       <w:pPr>
         <w:ind w:left="708"/>
+        <w:jc w:val="both"/>
       </w:pPr>
       <w:r>
         <w:t>A</w:t>
@@ -1281,6 +1288,7 @@
     <w:p>
       <w:pPr>
         <w:ind w:left="708"/>
+        <w:jc w:val="both"/>
       </w:pPr>
       <w:r>
         <w:t xml:space="preserve">"API Atualizada: Implementada Autenticação JWT completa para proteger </w:t>
@@ -1322,6 +1330,7 @@
     <w:p>
       <w:pPr>
         <w:ind w:left="708"/>
+        <w:jc w:val="both"/>
       </w:pPr>
       <w:r>
         <w:t xml:space="preserve">Ação: Permite que apenas usuários com um </w:t>
@@ -1338,6 +1347,7 @@
     <w:p>
       <w:pPr>
         <w:ind w:left="708"/>
+        <w:jc w:val="both"/>
       </w:pPr>
       <w:r>
         <w:t>"Métodos de validação foram revisados para padronizar retornos de erro (4xx/5xx)."</w:t>
@@ -1346,6 +1356,7 @@
     <w:p>
       <w:pPr>
         <w:ind w:left="708"/>
+        <w:jc w:val="both"/>
       </w:pPr>
       <w:r>
         <w:t xml:space="preserve">"As rotas foram </w:t>
@@ -1370,6 +1381,7 @@
     <w:p>
       <w:pPr>
         <w:ind w:left="708"/>
+        <w:jc w:val="both"/>
       </w:pPr>
       <w:r>
         <w:t>Uso de [</w:t>
@@ -1429,6 +1441,7 @@
     <w:p>
       <w:pPr>
         <w:ind w:left="708"/>
+        <w:jc w:val="both"/>
       </w:pPr>
       <w:r>
         <w:t xml:space="preserve">A proteção via JWT (ponto 1) é aplicada nas </w:t>
@@ -1459,9 +1472,9 @@
           <w:noProof/>
         </w:rPr>
         <w:drawing>
-          <wp:inline distT="0" distB="0" distL="0" distR="0" wp14:anchorId="1FFEF4DC" wp14:editId="666888E3">
-            <wp:extent cx="6472555" cy="487045"/>
-            <wp:effectExtent l="0" t="0" r="4445" b="8255"/>
+          <wp:inline distT="0" distB="0" distL="0" distR="0" wp14:anchorId="1FFEF4DC" wp14:editId="1CBC0DC5">
+            <wp:extent cx="5934075" cy="446526"/>
+            <wp:effectExtent l="0" t="0" r="0" b="0"/>
             <wp:docPr id="1" name="Imagem 1"/>
             <wp:cNvGraphicFramePr>
               <a:graphicFrameLocks xmlns:a="http://schemas.openxmlformats.org/drawingml/2006/main" noChangeAspect="1"/>
@@ -1482,7 +1495,7 @@
                   <pic:spPr>
                     <a:xfrm>
                       <a:off x="0" y="0"/>
-                      <a:ext cx="6472555" cy="487045"/>
+                      <a:ext cx="6119619" cy="460488"/>
                     </a:xfrm>
                     <a:prstGeom prst="rect">
                       <a:avLst/>
@@ -1498,6 +1511,7 @@
     <w:p>
       <w:pPr>
         <w:ind w:left="708"/>
+        <w:jc w:val="both"/>
       </w:pPr>
       <w:r>
         <w:t xml:space="preserve">Correções na validação de tamanho no campo de </w:t>
@@ -1600,9 +1614,9 @@
           <w:noProof/>
         </w:rPr>
         <w:drawing>
-          <wp:inline distT="0" distB="0" distL="0" distR="0" wp14:anchorId="1D35D1B5" wp14:editId="30DB49A2">
-            <wp:extent cx="6472555" cy="1365885"/>
-            <wp:effectExtent l="0" t="0" r="4445" b="5715"/>
+          <wp:inline distT="0" distB="0" distL="0" distR="0" wp14:anchorId="1D35D1B5" wp14:editId="24B1B68C">
+            <wp:extent cx="5981700" cy="1262301"/>
+            <wp:effectExtent l="0" t="0" r="0" b="0"/>
             <wp:docPr id="6" name="Imagem 6"/>
             <wp:cNvGraphicFramePr>
               <a:graphicFrameLocks xmlns:a="http://schemas.openxmlformats.org/drawingml/2006/main" noChangeAspect="1"/>
@@ -1623,7 +1637,7 @@
                   <pic:spPr>
                     <a:xfrm>
                       <a:off x="0" y="0"/>
-                      <a:ext cx="6472555" cy="1365885"/>
+                      <a:ext cx="6023585" cy="1271140"/>
                     </a:xfrm>
                     <a:prstGeom prst="rect">
                       <a:avLst/>
@@ -4410,18 +4424,18 @@
 </file>
 
 <file path=customXml/item1.xml><?xml version="1.0" encoding="utf-8"?>
-<p:properties xmlns:p="http://schemas.microsoft.com/office/2006/metadata/properties" xmlns:xsi="http://www.w3.org/2001/XMLSchema-instance" xmlns:pc="http://schemas.microsoft.com/office/infopath/2007/PartnerControls">
-  <documentManagement/>
-</p:properties>
-</file>
-
-<file path=customXml/item2.xml><?xml version="1.0" encoding="utf-8"?>
 <?mso-contentType ?>
 <FormTemplates xmlns="http://schemas.microsoft.com/sharepoint/v3/contenttype/forms">
   <Display>DocumentLibraryForm</Display>
   <Edit>DocumentLibraryForm</Edit>
   <New>DocumentLibraryForm</New>
 </FormTemplates>
+</file>
+
+<file path=customXml/item2.xml><?xml version="1.0" encoding="utf-8"?>
+<p:properties xmlns:p="http://schemas.microsoft.com/office/2006/metadata/properties" xmlns:xsi="http://www.w3.org/2001/XMLSchema-instance" xmlns:pc="http://schemas.microsoft.com/office/infopath/2007/PartnerControls">
+  <documentManagement/>
+</p:properties>
 </file>
 
 <file path=customXml/item3.xml><?xml version="1.0" encoding="utf-8"?>
@@ -4563,18 +4577,18 @@
 </file>
 
 <file path=customXml/itemProps1.xml><?xml version="1.0" encoding="utf-8"?>
-<ds:datastoreItem xmlns:ds="http://schemas.openxmlformats.org/officeDocument/2006/customXml" ds:itemID="{0028EFB7-3706-477C-BC22-76AF0C752638}">
+<ds:datastoreItem xmlns:ds="http://schemas.openxmlformats.org/officeDocument/2006/customXml" ds:itemID="{0876BD9A-9CA5-48C2-BF8E-F2DECFB0FD38}">
   <ds:schemaRefs>
-    <ds:schemaRef ds:uri="http://schemas.microsoft.com/office/2006/metadata/properties"/>
-    <ds:schemaRef ds:uri="http://schemas.microsoft.com/office/infopath/2007/PartnerControls"/>
+    <ds:schemaRef ds:uri="http://schemas.microsoft.com/sharepoint/v3/contenttype/forms"/>
   </ds:schemaRefs>
 </ds:datastoreItem>
 </file>
 
 <file path=customXml/itemProps2.xml><?xml version="1.0" encoding="utf-8"?>
-<ds:datastoreItem xmlns:ds="http://schemas.openxmlformats.org/officeDocument/2006/customXml" ds:itemID="{0876BD9A-9CA5-48C2-BF8E-F2DECFB0FD38}">
+<ds:datastoreItem xmlns:ds="http://schemas.openxmlformats.org/officeDocument/2006/customXml" ds:itemID="{0028EFB7-3706-477C-BC22-76AF0C752638}">
   <ds:schemaRefs>
-    <ds:schemaRef ds:uri="http://schemas.microsoft.com/sharepoint/v3/contenttype/forms"/>
+    <ds:schemaRef ds:uri="http://schemas.microsoft.com/office/2006/metadata/properties"/>
+    <ds:schemaRef ds:uri="http://schemas.microsoft.com/office/infopath/2007/PartnerControls"/>
   </ds:schemaRefs>
 </ds:datastoreItem>
 </file>

</xml_diff>

<commit_message>
:books: docs: Atualização documentação
</commit_message>
<xml_diff>
--- a/Documents/Documents/Sprint11_Task145_Implementação_de_validações_padronizações_position.docx
+++ b/Documents/Documents/Sprint11_Task145_Implementação_de_validações_padronizações_position.docx
@@ -587,6 +587,9 @@
             <w:r>
               <w:t>Implementações de padronizações</w:t>
             </w:r>
+            <w:r>
+              <w:t xml:space="preserve"> position</w:t>
+            </w:r>
           </w:p>
         </w:tc>
         <w:tc>
@@ -880,6 +883,9 @@
             </w:r>
             <w:r>
               <w:t>Implementações de padronizações</w:t>
+            </w:r>
+            <w:r>
+              <w:t xml:space="preserve"> position</w:t>
             </w:r>
           </w:p>
         </w:tc>

</xml_diff>

<commit_message>
:books: fix: Documentação padrões position
</commit_message>
<xml_diff>
--- a/Documents/Documents/Sprint11_Task145_Implementação_de_validações_padronizações_position.docx
+++ b/Documents/Documents/Sprint11_Task145_Implementação_de_validações_padronizações_position.docx
@@ -1,6 +1,6 @@
 
 <file path=word/document.xml><?xml version="1.0" encoding="utf-8"?>
-<w:document xmlns:wpc="http://schemas.microsoft.com/office/word/2010/wordprocessingCanvas" xmlns:cx="http://schemas.microsoft.com/office/drawing/2014/chartex" xmlns:cx1="http://schemas.microsoft.com/office/drawing/2015/9/8/chartex" xmlns:cx2="http://schemas.microsoft.com/office/drawing/2015/10/21/chartex" xmlns:cx3="http://schemas.microsoft.com/office/drawing/2016/5/9/chartex" xmlns:cx4="http://schemas.microsoft.com/office/drawing/2016/5/10/chartex" xmlns:cx5="http://schemas.microsoft.com/office/drawing/2016/5/11/chartex" xmlns:cx6="http://schemas.microsoft.com/office/drawing/2016/5/12/chartex" xmlns:cx7="http://schemas.microsoft.com/office/drawing/2016/5/13/chartex" xmlns:cx8="http://schemas.microsoft.com/office/drawing/2016/5/14/chartex" xmlns:mc="http://schemas.openxmlformats.org/markup-compatibility/2006" xmlns:aink="http://schemas.microsoft.com/office/drawing/2016/ink" xmlns:am3d="http://schemas.microsoft.com/office/drawing/2017/model3d" xmlns:o="urn:schemas-microsoft-com:office:office" xmlns:oel="http://schemas.microsoft.com/office/2019/extlst" xmlns:r="http://schemas.openxmlformats.org/officeDocument/2006/relationships" xmlns:m="http://schemas.openxmlformats.org/officeDocument/2006/math" xmlns:v="urn:schemas-microsoft-com:vml" xmlns:wp14="http://schemas.microsoft.com/office/word/2010/wordprocessingDrawing" xmlns:wp="http://schemas.openxmlformats.org/drawingml/2006/wordprocessingDrawing" xmlns:w10="urn:schemas-microsoft-com:office:word" xmlns:w="http://schemas.openxmlformats.org/wordprocessingml/2006/main" xmlns:w14="http://schemas.microsoft.com/office/word/2010/wordml" xmlns:w15="http://schemas.microsoft.com/office/word/2012/wordml" xmlns:w16cex="http://schemas.microsoft.com/office/word/2018/wordml/cex" xmlns:w16cid="http://schemas.microsoft.com/office/word/2016/wordml/cid" xmlns:w16="http://schemas.microsoft.com/office/word/2018/wordml" xmlns:w16du="http://schemas.microsoft.com/office/word/2023/wordml/word16du" xmlns:w16sdtdh="http://schemas.microsoft.com/office/word/2020/wordml/sdtdatahash" xmlns:w16sdtfl="http://schemas.microsoft.com/office/word/2024/wordml/sdtformatlock" xmlns:w16se="http://schemas.microsoft.com/office/word/2015/wordml/symex" xmlns:wpg="http://schemas.microsoft.com/office/word/2010/wordprocessingGroup" xmlns:wpi="http://schemas.microsoft.com/office/word/2010/wordprocessingInk" xmlns:wne="http://schemas.microsoft.com/office/word/2006/wordml" xmlns:wps="http://schemas.microsoft.com/office/word/2010/wordprocessingShape" mc:Ignorable="w14 w15 w16se w16cid w16 w16cex w16sdtdh w16sdtfl w16du wp14">
+<w:document xmlns:wpc="http://schemas.microsoft.com/office/word/2010/wordprocessingCanvas" xmlns:cx="http://schemas.microsoft.com/office/drawing/2014/chartex" xmlns:cx1="http://schemas.microsoft.com/office/drawing/2015/9/8/chartex" xmlns:cx2="http://schemas.microsoft.com/office/drawing/2015/10/21/chartex" xmlns:cx3="http://schemas.microsoft.com/office/drawing/2016/5/9/chartex" xmlns:cx4="http://schemas.microsoft.com/office/drawing/2016/5/10/chartex" xmlns:cx5="http://schemas.microsoft.com/office/drawing/2016/5/11/chartex" xmlns:cx6="http://schemas.microsoft.com/office/drawing/2016/5/12/chartex" xmlns:cx7="http://schemas.microsoft.com/office/drawing/2016/5/13/chartex" xmlns:cx8="http://schemas.microsoft.com/office/drawing/2016/5/14/chartex" xmlns:mc="http://schemas.openxmlformats.org/markup-compatibility/2006" xmlns:aink="http://schemas.microsoft.com/office/drawing/2016/ink" xmlns:am3d="http://schemas.microsoft.com/office/drawing/2017/model3d" xmlns:o="urn:schemas-microsoft-com:office:office" xmlns:r="http://schemas.openxmlformats.org/officeDocument/2006/relationships" xmlns:m="http://schemas.openxmlformats.org/officeDocument/2006/math" xmlns:v="urn:schemas-microsoft-com:vml" xmlns:wp14="http://schemas.microsoft.com/office/word/2010/wordprocessingDrawing" xmlns:wp="http://schemas.openxmlformats.org/drawingml/2006/wordprocessingDrawing" xmlns:w10="urn:schemas-microsoft-com:office:word" xmlns:w="http://schemas.openxmlformats.org/wordprocessingml/2006/main" xmlns:w14="http://schemas.microsoft.com/office/word/2010/wordml" xmlns:w15="http://schemas.microsoft.com/office/word/2012/wordml" xmlns:w16cid="http://schemas.microsoft.com/office/word/2016/wordml/cid" xmlns:w16se="http://schemas.microsoft.com/office/word/2015/wordml/symex" xmlns:wpg="http://schemas.microsoft.com/office/word/2010/wordprocessingGroup" xmlns:wpi="http://schemas.microsoft.com/office/word/2010/wordprocessingInk" xmlns:wne="http://schemas.microsoft.com/office/word/2006/wordml" xmlns:wps="http://schemas.microsoft.com/office/word/2010/wordprocessingShape" mc:Ignorable="w14 w15 w16se w16cid wp14">
   <w:body>
     <w:p>
       <w:pPr>
@@ -438,7 +438,16 @@
             <w:tcW w:w="9493" w:type="dxa"/>
             <w:gridSpan w:val="3"/>
           </w:tcPr>
-          <w:p/>
+          <w:p>
+            <w:proofErr w:type="spellStart"/>
+            <w:r>
+              <w:t>Franciane</w:t>
+            </w:r>
+            <w:proofErr w:type="spellEnd"/>
+            <w:r>
+              <w:t xml:space="preserve"> Ramos Franco </w:t>
+            </w:r>
+          </w:p>
         </w:tc>
       </w:tr>
       <w:tr>
@@ -447,7 +456,11 @@
             <w:tcW w:w="9493" w:type="dxa"/>
             <w:gridSpan w:val="3"/>
           </w:tcPr>
-          <w:p/>
+          <w:p>
+            <w:r>
+              <w:t>Renato Dos Santos Filho</w:t>
+            </w:r>
+          </w:p>
         </w:tc>
       </w:tr>
       <w:tr>
@@ -456,7 +469,24 @@
             <w:tcW w:w="9493" w:type="dxa"/>
             <w:gridSpan w:val="3"/>
           </w:tcPr>
-          <w:p/>
+          <w:p>
+            <w:r>
+              <w:t xml:space="preserve">Marco </w:t>
+            </w:r>
+            <w:proofErr w:type="spellStart"/>
+            <w:r>
+              <w:t>Antonio</w:t>
+            </w:r>
+            <w:proofErr w:type="spellEnd"/>
+            <w:r>
+              <w:t xml:space="preserve"> dos Santos </w:t>
+            </w:r>
+            <w:proofErr w:type="spellStart"/>
+            <w:r>
+              <w:t>Masson</w:t>
+            </w:r>
+            <w:proofErr w:type="spellEnd"/>
+          </w:p>
         </w:tc>
       </w:tr>
       <w:tr>
@@ -465,7 +495,11 @@
             <w:tcW w:w="9493" w:type="dxa"/>
             <w:gridSpan w:val="3"/>
           </w:tcPr>
-          <w:p/>
+          <w:p>
+            <w:r>
+              <w:t>Vinicius Lúcio Marcolino Da Silva</w:t>
+            </w:r>
+          </w:p>
         </w:tc>
       </w:tr>
     </w:tbl>
@@ -482,10 +516,10 @@
         <w:tblLook w:val="04A0" w:firstRow="1" w:lastRow="0" w:firstColumn="1" w:lastColumn="0" w:noHBand="0" w:noVBand="1"/>
       </w:tblPr>
       <w:tblGrid>
-        <w:gridCol w:w="754"/>
-        <w:gridCol w:w="5910"/>
-        <w:gridCol w:w="1523"/>
-        <w:gridCol w:w="1306"/>
+        <w:gridCol w:w="751"/>
+        <w:gridCol w:w="5940"/>
+        <w:gridCol w:w="1524"/>
+        <w:gridCol w:w="1278"/>
       </w:tblGrid>
       <w:tr>
         <w:tc>
@@ -753,12 +787,21 @@
                 <w:bCs/>
               </w:rPr>
             </w:pPr>
+            <w:proofErr w:type="spellStart"/>
             <w:r>
               <w:rPr>
                 <w:b/>
                 <w:bCs/>
               </w:rPr>
-              <w:t xml:space="preserve">Task </w:t>
+              <w:t>Task</w:t>
+            </w:r>
+            <w:proofErr w:type="spellEnd"/>
+            <w:r>
+              <w:rPr>
+                <w:b/>
+                <w:bCs/>
+              </w:rPr>
+              <w:t xml:space="preserve"> </w:t>
             </w:r>
             <w:proofErr w:type="spellStart"/>
             <w:r>
@@ -1247,176 +1290,8 @@
           </wp:inline>
         </w:drawing>
       </w:r>
-    </w:p>
-    <w:p>
-      <w:pPr>
-        <w:ind w:left="708"/>
-      </w:pPr>
-    </w:p>
-    <w:p>
-      <w:pPr>
-        <w:ind w:left="708"/>
-        <w:jc w:val="both"/>
-      </w:pPr>
-      <w:r>
-        <w:t>A</w:t>
-      </w:r>
-      <w:r>
-        <w:t>utentica</w:t>
-      </w:r>
-      <w:r>
-        <w:rPr>
-          <w:rFonts w:hint="cs"/>
-        </w:rPr>
-        <w:t>çã</w:t>
-      </w:r>
-      <w:r>
-        <w:t>o nas rotas</w:t>
-      </w:r>
-      <w:r>
-        <w:t xml:space="preserve"> tem o objetivo é resumir as alterações feitas de forma simples, focando em: Autenticação JWT, Inclusão na </w:t>
-      </w:r>
-      <w:proofErr w:type="spellStart"/>
-      <w:r>
-        <w:t>Controller</w:t>
-      </w:r>
-      <w:proofErr w:type="spellEnd"/>
-      <w:r>
-        <w:t xml:space="preserve"> position</w:t>
-      </w:r>
-      <w:r>
-        <w:t>, Alterações de Retorno de Validação e Versionamento de Rotas.</w:t>
-      </w:r>
-    </w:p>
-    <w:p>
-      <w:pPr>
-        <w:ind w:left="708"/>
-        <w:jc w:val="both"/>
-      </w:pPr>
-      <w:r>
-        <w:t xml:space="preserve">"API Atualizada: Implementada Autenticação JWT completa para proteger </w:t>
-      </w:r>
-      <w:r>
-        <w:t>a</w:t>
-      </w:r>
-      <w:r>
-        <w:t xml:space="preserve"> </w:t>
-      </w:r>
-      <w:proofErr w:type="spellStart"/>
-      <w:r>
-        <w:t>Controller</w:t>
-      </w:r>
-      <w:proofErr w:type="spellEnd"/>
-      <w:r>
-        <w:t xml:space="preserve"> position</w:t>
-      </w:r>
-      <w:r>
-        <w:t xml:space="preserve">. Métodos de validação foram revisados para padronizar retornos de erro (4xx/5xx). As rotas foram </w:t>
-      </w:r>
-      <w:proofErr w:type="spellStart"/>
-      <w:r>
-        <w:t>versionadas</w:t>
-      </w:r>
-      <w:proofErr w:type="spellEnd"/>
-      <w:r>
-        <w:t xml:space="preserve"> para 'api/v1'."</w:t>
-      </w:r>
-    </w:p>
-    <w:p>
-      <w:pPr>
-        <w:ind w:left="708"/>
-        <w:jc w:val="both"/>
-      </w:pPr>
-      <w:r>
-        <w:t>Ação: Permite que apenas usuários com um token válido acessem os recursos.</w:t>
-      </w:r>
-    </w:p>
-    <w:p>
-      <w:pPr>
-        <w:ind w:left="708"/>
-        <w:jc w:val="both"/>
-      </w:pPr>
-      <w:r>
-        <w:t>"Métodos de validação foram revisados para padronizar retornos de erro (4xx/5xx)."</w:t>
-      </w:r>
-    </w:p>
-    <w:p>
-      <w:pPr>
-        <w:ind w:left="708"/>
-        <w:jc w:val="both"/>
-      </w:pPr>
-      <w:r>
-        <w:t xml:space="preserve">"As rotas foram </w:t>
-      </w:r>
-      <w:proofErr w:type="spellStart"/>
-      <w:r>
-        <w:t>versionadas</w:t>
-      </w:r>
-      <w:proofErr w:type="spellEnd"/>
-      <w:r>
-        <w:t xml:space="preserve"> para 'api/v1'."</w:t>
-      </w:r>
-    </w:p>
-    <w:p>
-      <w:pPr>
-        <w:ind w:left="708"/>
-        <w:jc w:val="both"/>
-      </w:pPr>
-      <w:r>
-        <w:t>Uso de [Route("api/v1/[</w:t>
-      </w:r>
-      <w:proofErr w:type="spellStart"/>
-      <w:r>
-        <w:t>controller</w:t>
-      </w:r>
-      <w:proofErr w:type="spellEnd"/>
-      <w:r>
-        <w:t xml:space="preserve">]")] na classe </w:t>
-      </w:r>
-      <w:proofErr w:type="spellStart"/>
-      <w:r>
-        <w:t>Position</w:t>
-      </w:r>
-      <w:r>
-        <w:t>Controller</w:t>
-      </w:r>
-      <w:proofErr w:type="spellEnd"/>
-      <w:r>
-        <w:t>, garantindo que a API possa evoluir no futuro (</w:t>
-      </w:r>
-      <w:proofErr w:type="spellStart"/>
-      <w:r>
-        <w:t>ex</w:t>
-      </w:r>
-      <w:proofErr w:type="spellEnd"/>
-      <w:r>
-        <w:t>: api/v2/).</w:t>
-      </w:r>
-    </w:p>
-    <w:p>
-      <w:pPr>
-        <w:ind w:left="708"/>
-        <w:jc w:val="both"/>
-      </w:pPr>
-      <w:r>
-        <w:t xml:space="preserve">A proteção via JWT (ponto 1) é aplicada nas </w:t>
-      </w:r>
-      <w:proofErr w:type="spellStart"/>
-      <w:r>
-        <w:t>Controllers</w:t>
-      </w:r>
-      <w:proofErr w:type="spellEnd"/>
-      <w:r>
-        <w:t xml:space="preserve"> usando anotações como [</w:t>
-      </w:r>
-      <w:proofErr w:type="spellStart"/>
-      <w:r>
-        <w:t>Authorize</w:t>
-      </w:r>
-      <w:proofErr w:type="spellEnd"/>
-      <w:r>
-        <w:t>].</w:t>
-      </w:r>
+      <w:bookmarkStart w:id="0" w:name="_GoBack"/>
+      <w:bookmarkEnd w:id="0"/>
     </w:p>
     <w:p>
       <w:pPr>
@@ -1427,10 +1302,10 @@
           <w:noProof/>
         </w:rPr>
         <w:drawing>
-          <wp:inline distT="0" distB="0" distL="0" distR="0" wp14:anchorId="1FFEF4DC" wp14:editId="1CBC0DC5">
-            <wp:extent cx="5934075" cy="446526"/>
-            <wp:effectExtent l="0" t="0" r="0" b="0"/>
-            <wp:docPr id="1" name="Imagem 1"/>
+          <wp:inline distT="0" distB="0" distL="0" distR="0" wp14:anchorId="65744F91" wp14:editId="3A1D6D48">
+            <wp:extent cx="4095238" cy="1514286"/>
+            <wp:effectExtent l="0" t="0" r="635" b="0"/>
+            <wp:docPr id="5" name="Imagem 5"/>
             <wp:cNvGraphicFramePr>
               <a:graphicFrameLocks xmlns:a="http://schemas.openxmlformats.org/drawingml/2006/main" noChangeAspect="1"/>
             </wp:cNvGraphicFramePr>
@@ -1450,6 +1325,257 @@
                   <pic:spPr>
                     <a:xfrm>
                       <a:off x="0" y="0"/>
+                      <a:ext cx="4095238" cy="1514286"/>
+                    </a:xfrm>
+                    <a:prstGeom prst="rect">
+                      <a:avLst/>
+                    </a:prstGeom>
+                  </pic:spPr>
+                </pic:pic>
+              </a:graphicData>
+            </a:graphic>
+          </wp:inline>
+        </w:drawing>
+      </w:r>
+    </w:p>
+    <w:p>
+      <w:pPr>
+        <w:ind w:left="708"/>
+        <w:jc w:val="both"/>
+      </w:pPr>
+      <w:r>
+        <w:t>A</w:t>
+      </w:r>
+      <w:r>
+        <w:t>utentica</w:t>
+      </w:r>
+      <w:r>
+        <w:rPr>
+          <w:rFonts w:hint="cs"/>
+        </w:rPr>
+        <w:t>çã</w:t>
+      </w:r>
+      <w:r>
+        <w:t>o nas rotas</w:t>
+      </w:r>
+      <w:r>
+        <w:t xml:space="preserve"> tem o objetivo é resumir as alterações feitas de forma simples, focando em: Autenticação JWT, Inclusão na </w:t>
+      </w:r>
+      <w:proofErr w:type="spellStart"/>
+      <w:r>
+        <w:t>Controller</w:t>
+      </w:r>
+      <w:proofErr w:type="spellEnd"/>
+      <w:r>
+        <w:t xml:space="preserve"> position</w:t>
+      </w:r>
+      <w:r>
+        <w:t>, Alterações de Retorno de Validação e Versionamento de Rotas.</w:t>
+      </w:r>
+    </w:p>
+    <w:p>
+      <w:pPr>
+        <w:ind w:left="708"/>
+        <w:jc w:val="both"/>
+      </w:pPr>
+      <w:r>
+        <w:t xml:space="preserve">"API Atualizada: Implementada Autenticação JWT completa para proteger </w:t>
+      </w:r>
+      <w:r>
+        <w:t>a</w:t>
+      </w:r>
+      <w:r>
+        <w:t xml:space="preserve"> </w:t>
+      </w:r>
+      <w:proofErr w:type="spellStart"/>
+      <w:r>
+        <w:t>Controller</w:t>
+      </w:r>
+      <w:proofErr w:type="spellEnd"/>
+      <w:r>
+        <w:t xml:space="preserve"> position</w:t>
+      </w:r>
+      <w:r>
+        <w:t xml:space="preserve">. Métodos de validação foram revisados para padronizar retornos de erro (4xx/5xx). As rotas foram </w:t>
+      </w:r>
+      <w:proofErr w:type="spellStart"/>
+      <w:r>
+        <w:t>versionadas</w:t>
+      </w:r>
+      <w:proofErr w:type="spellEnd"/>
+      <w:r>
+        <w:t xml:space="preserve"> para '</w:t>
+      </w:r>
+      <w:proofErr w:type="spellStart"/>
+      <w:r>
+        <w:t>api</w:t>
+      </w:r>
+      <w:proofErr w:type="spellEnd"/>
+      <w:r>
+        <w:t>/v1'."</w:t>
+      </w:r>
+    </w:p>
+    <w:p>
+      <w:pPr>
+        <w:ind w:left="708"/>
+        <w:jc w:val="both"/>
+      </w:pPr>
+      <w:r>
+        <w:t>Ação: Permite que apenas usuários com um token válido acessem os recursos.</w:t>
+      </w:r>
+    </w:p>
+    <w:p>
+      <w:pPr>
+        <w:ind w:left="708"/>
+        <w:jc w:val="both"/>
+      </w:pPr>
+      <w:r>
+        <w:t>"Métodos de validação foram revisados para padronizar retornos de erro (4xx/5xx)."</w:t>
+      </w:r>
+    </w:p>
+    <w:p>
+      <w:pPr>
+        <w:ind w:left="708"/>
+        <w:jc w:val="both"/>
+      </w:pPr>
+      <w:r>
+        <w:t xml:space="preserve">"As rotas foram </w:t>
+      </w:r>
+      <w:proofErr w:type="spellStart"/>
+      <w:r>
+        <w:t>versionadas</w:t>
+      </w:r>
+      <w:proofErr w:type="spellEnd"/>
+      <w:r>
+        <w:t xml:space="preserve"> para '</w:t>
+      </w:r>
+      <w:proofErr w:type="spellStart"/>
+      <w:r>
+        <w:t>api</w:t>
+      </w:r>
+      <w:proofErr w:type="spellEnd"/>
+      <w:r>
+        <w:t>/v1'."</w:t>
+      </w:r>
+    </w:p>
+    <w:p>
+      <w:pPr>
+        <w:ind w:left="708"/>
+        <w:jc w:val="both"/>
+      </w:pPr>
+      <w:r>
+        <w:t>Uso de [</w:t>
+      </w:r>
+      <w:proofErr w:type="spellStart"/>
+      <w:r>
+        <w:t>Route</w:t>
+      </w:r>
+      <w:proofErr w:type="spellEnd"/>
+      <w:r>
+        <w:t>("</w:t>
+      </w:r>
+      <w:proofErr w:type="spellStart"/>
+      <w:r>
+        <w:t>api</w:t>
+      </w:r>
+      <w:proofErr w:type="spellEnd"/>
+      <w:r>
+        <w:t>/v1/[</w:t>
+      </w:r>
+      <w:proofErr w:type="spellStart"/>
+      <w:r>
+        <w:t>controller</w:t>
+      </w:r>
+      <w:proofErr w:type="spellEnd"/>
+      <w:r>
+        <w:t xml:space="preserve">]")] na classe </w:t>
+      </w:r>
+      <w:proofErr w:type="spellStart"/>
+      <w:r>
+        <w:t>Position</w:t>
+      </w:r>
+      <w:r>
+        <w:t>Controller</w:t>
+      </w:r>
+      <w:proofErr w:type="spellEnd"/>
+      <w:r>
+        <w:t>, garantindo que a API possa evoluir no futuro (</w:t>
+      </w:r>
+      <w:proofErr w:type="spellStart"/>
+      <w:r>
+        <w:t>ex</w:t>
+      </w:r>
+      <w:proofErr w:type="spellEnd"/>
+      <w:r>
+        <w:t xml:space="preserve">: </w:t>
+      </w:r>
+      <w:proofErr w:type="spellStart"/>
+      <w:r>
+        <w:t>api</w:t>
+      </w:r>
+      <w:proofErr w:type="spellEnd"/>
+      <w:r>
+        <w:t>/v2/).</w:t>
+      </w:r>
+    </w:p>
+    <w:p>
+      <w:pPr>
+        <w:ind w:left="708"/>
+        <w:jc w:val="both"/>
+      </w:pPr>
+      <w:r>
+        <w:t xml:space="preserve">A proteção via JWT (ponto 1) é aplicada nas </w:t>
+      </w:r>
+      <w:proofErr w:type="spellStart"/>
+      <w:r>
+        <w:t>Controllers</w:t>
+      </w:r>
+      <w:proofErr w:type="spellEnd"/>
+      <w:r>
+        <w:t xml:space="preserve"> usando anotações como [</w:t>
+      </w:r>
+      <w:proofErr w:type="spellStart"/>
+      <w:r>
+        <w:t>Authorize</w:t>
+      </w:r>
+      <w:proofErr w:type="spellEnd"/>
+      <w:r>
+        <w:t>].</w:t>
+      </w:r>
+    </w:p>
+    <w:p>
+      <w:pPr>
+        <w:ind w:left="708"/>
+      </w:pPr>
+      <w:r>
+        <w:rPr>
+          <w:noProof/>
+        </w:rPr>
+        <w:lastRenderedPageBreak/>
+        <w:drawing>
+          <wp:inline distT="0" distB="0" distL="0" distR="0" wp14:anchorId="1FFEF4DC" wp14:editId="1CBC0DC5">
+            <wp:extent cx="5934075" cy="446526"/>
+            <wp:effectExtent l="0" t="0" r="0" b="0"/>
+            <wp:docPr id="1" name="Imagem 1"/>
+            <wp:cNvGraphicFramePr>
+              <a:graphicFrameLocks xmlns:a="http://schemas.openxmlformats.org/drawingml/2006/main" noChangeAspect="1"/>
+            </wp:cNvGraphicFramePr>
+            <a:graphic xmlns:a="http://schemas.openxmlformats.org/drawingml/2006/main">
+              <a:graphicData uri="http://schemas.openxmlformats.org/drawingml/2006/picture">
+                <pic:pic xmlns:pic="http://schemas.openxmlformats.org/drawingml/2006/picture">
+                  <pic:nvPicPr>
+                    <pic:cNvPr id="1" name=""/>
+                    <pic:cNvPicPr/>
+                  </pic:nvPicPr>
+                  <pic:blipFill>
+                    <a:blip r:embed="rId14"/>
+                    <a:stretch>
+                      <a:fillRect/>
+                    </a:stretch>
+                  </pic:blipFill>
+                  <pic:spPr>
+                    <a:xfrm>
+                      <a:off x="0" y="0"/>
                       <a:ext cx="6119619" cy="460488"/>
                     </a:xfrm>
                     <a:prstGeom prst="rect">
@@ -1521,7 +1647,6 @@
         <w:rPr>
           <w:noProof/>
         </w:rPr>
-        <w:lastRenderedPageBreak/>
         <w:t xml:space="preserve"> </w:t>
       </w:r>
       <w:r>
@@ -1544,7 +1669,7 @@
                     <pic:cNvPicPr/>
                   </pic:nvPicPr>
                   <pic:blipFill>
-                    <a:blip r:embed="rId14"/>
+                    <a:blip r:embed="rId15"/>
                     <a:stretch>
                       <a:fillRect/>
                     </a:stretch>
@@ -1731,7 +1856,7 @@
 </file>
 
 <file path=word/endnotes.xml><?xml version="1.0" encoding="utf-8"?>
-<w:endnotes xmlns:wpc="http://schemas.microsoft.com/office/word/2010/wordprocessingCanvas" xmlns:cx="http://schemas.microsoft.com/office/drawing/2014/chartex" xmlns:cx1="http://schemas.microsoft.com/office/drawing/2015/9/8/chartex" xmlns:cx2="http://schemas.microsoft.com/office/drawing/2015/10/21/chartex" xmlns:cx3="http://schemas.microsoft.com/office/drawing/2016/5/9/chartex" xmlns:cx4="http://schemas.microsoft.com/office/drawing/2016/5/10/chartex" xmlns:cx5="http://schemas.microsoft.com/office/drawing/2016/5/11/chartex" xmlns:cx6="http://schemas.microsoft.com/office/drawing/2016/5/12/chartex" xmlns:cx7="http://schemas.microsoft.com/office/drawing/2016/5/13/chartex" xmlns:cx8="http://schemas.microsoft.com/office/drawing/2016/5/14/chartex" xmlns:mc="http://schemas.openxmlformats.org/markup-compatibility/2006" xmlns:aink="http://schemas.microsoft.com/office/drawing/2016/ink" xmlns:am3d="http://schemas.microsoft.com/office/drawing/2017/model3d" xmlns:o="urn:schemas-microsoft-com:office:office" xmlns:oel="http://schemas.microsoft.com/office/2019/extlst" xmlns:r="http://schemas.openxmlformats.org/officeDocument/2006/relationships" xmlns:m="http://schemas.openxmlformats.org/officeDocument/2006/math" xmlns:v="urn:schemas-microsoft-com:vml" xmlns:wp14="http://schemas.microsoft.com/office/word/2010/wordprocessingDrawing" xmlns:wp="http://schemas.openxmlformats.org/drawingml/2006/wordprocessingDrawing" xmlns:w10="urn:schemas-microsoft-com:office:word" xmlns:w="http://schemas.openxmlformats.org/wordprocessingml/2006/main" xmlns:w14="http://schemas.microsoft.com/office/word/2010/wordml" xmlns:w15="http://schemas.microsoft.com/office/word/2012/wordml" xmlns:w16cex="http://schemas.microsoft.com/office/word/2018/wordml/cex" xmlns:w16cid="http://schemas.microsoft.com/office/word/2016/wordml/cid" xmlns:w16="http://schemas.microsoft.com/office/word/2018/wordml" xmlns:w16du="http://schemas.microsoft.com/office/word/2023/wordml/word16du" xmlns:w16sdtdh="http://schemas.microsoft.com/office/word/2020/wordml/sdtdatahash" xmlns:w16sdtfl="http://schemas.microsoft.com/office/word/2024/wordml/sdtformatlock" xmlns:w16se="http://schemas.microsoft.com/office/word/2015/wordml/symex" xmlns:wpg="http://schemas.microsoft.com/office/word/2010/wordprocessingGroup" xmlns:wpi="http://schemas.microsoft.com/office/word/2010/wordprocessingInk" xmlns:wne="http://schemas.microsoft.com/office/word/2006/wordml" xmlns:wps="http://schemas.microsoft.com/office/word/2010/wordprocessingShape" mc:Ignorable="w14 w15 w16se w16cid w16 w16cex w16sdtdh w16sdtfl w16du wp14">
+<w:endnotes xmlns:wpc="http://schemas.microsoft.com/office/word/2010/wordprocessingCanvas" xmlns:cx="http://schemas.microsoft.com/office/drawing/2014/chartex" xmlns:cx1="http://schemas.microsoft.com/office/drawing/2015/9/8/chartex" xmlns:cx2="http://schemas.microsoft.com/office/drawing/2015/10/21/chartex" xmlns:cx3="http://schemas.microsoft.com/office/drawing/2016/5/9/chartex" xmlns:cx4="http://schemas.microsoft.com/office/drawing/2016/5/10/chartex" xmlns:cx5="http://schemas.microsoft.com/office/drawing/2016/5/11/chartex" xmlns:cx6="http://schemas.microsoft.com/office/drawing/2016/5/12/chartex" xmlns:cx7="http://schemas.microsoft.com/office/drawing/2016/5/13/chartex" xmlns:cx8="http://schemas.microsoft.com/office/drawing/2016/5/14/chartex" xmlns:mc="http://schemas.openxmlformats.org/markup-compatibility/2006" xmlns:aink="http://schemas.microsoft.com/office/drawing/2016/ink" xmlns:am3d="http://schemas.microsoft.com/office/drawing/2017/model3d" xmlns:o="urn:schemas-microsoft-com:office:office" xmlns:r="http://schemas.openxmlformats.org/officeDocument/2006/relationships" xmlns:m="http://schemas.openxmlformats.org/officeDocument/2006/math" xmlns:v="urn:schemas-microsoft-com:vml" xmlns:wp14="http://schemas.microsoft.com/office/word/2010/wordprocessingDrawing" xmlns:wp="http://schemas.openxmlformats.org/drawingml/2006/wordprocessingDrawing" xmlns:w10="urn:schemas-microsoft-com:office:word" xmlns:w="http://schemas.openxmlformats.org/wordprocessingml/2006/main" xmlns:w14="http://schemas.microsoft.com/office/word/2010/wordml" xmlns:w15="http://schemas.microsoft.com/office/word/2012/wordml" xmlns:w16cid="http://schemas.microsoft.com/office/word/2016/wordml/cid" xmlns:w16se="http://schemas.microsoft.com/office/word/2015/wordml/symex" xmlns:wpg="http://schemas.microsoft.com/office/word/2010/wordprocessingGroup" xmlns:wpi="http://schemas.microsoft.com/office/word/2010/wordprocessingInk" xmlns:wne="http://schemas.microsoft.com/office/word/2006/wordml" xmlns:wps="http://schemas.microsoft.com/office/word/2010/wordprocessingShape" mc:Ignorable="w14 w15 w16se w16cid wp14">
   <w:endnote w:type="separator" w:id="-1">
     <w:p>
       <w:pPr>
@@ -1756,7 +1881,7 @@
 </file>
 
 <file path=word/footnotes.xml><?xml version="1.0" encoding="utf-8"?>
-<w:footnotes xmlns:wpc="http://schemas.microsoft.com/office/word/2010/wordprocessingCanvas" xmlns:cx="http://schemas.microsoft.com/office/drawing/2014/chartex" xmlns:cx1="http://schemas.microsoft.com/office/drawing/2015/9/8/chartex" xmlns:cx2="http://schemas.microsoft.com/office/drawing/2015/10/21/chartex" xmlns:cx3="http://schemas.microsoft.com/office/drawing/2016/5/9/chartex" xmlns:cx4="http://schemas.microsoft.com/office/drawing/2016/5/10/chartex" xmlns:cx5="http://schemas.microsoft.com/office/drawing/2016/5/11/chartex" xmlns:cx6="http://schemas.microsoft.com/office/drawing/2016/5/12/chartex" xmlns:cx7="http://schemas.microsoft.com/office/drawing/2016/5/13/chartex" xmlns:cx8="http://schemas.microsoft.com/office/drawing/2016/5/14/chartex" xmlns:mc="http://schemas.openxmlformats.org/markup-compatibility/2006" xmlns:aink="http://schemas.microsoft.com/office/drawing/2016/ink" xmlns:am3d="http://schemas.microsoft.com/office/drawing/2017/model3d" xmlns:o="urn:schemas-microsoft-com:office:office" xmlns:oel="http://schemas.microsoft.com/office/2019/extlst" xmlns:r="http://schemas.openxmlformats.org/officeDocument/2006/relationships" xmlns:m="http://schemas.openxmlformats.org/officeDocument/2006/math" xmlns:v="urn:schemas-microsoft-com:vml" xmlns:wp14="http://schemas.microsoft.com/office/word/2010/wordprocessingDrawing" xmlns:wp="http://schemas.openxmlformats.org/drawingml/2006/wordprocessingDrawing" xmlns:w10="urn:schemas-microsoft-com:office:word" xmlns:w="http://schemas.openxmlformats.org/wordprocessingml/2006/main" xmlns:w14="http://schemas.microsoft.com/office/word/2010/wordml" xmlns:w15="http://schemas.microsoft.com/office/word/2012/wordml" xmlns:w16cex="http://schemas.microsoft.com/office/word/2018/wordml/cex" xmlns:w16cid="http://schemas.microsoft.com/office/word/2016/wordml/cid" xmlns:w16="http://schemas.microsoft.com/office/word/2018/wordml" xmlns:w16du="http://schemas.microsoft.com/office/word/2023/wordml/word16du" xmlns:w16sdtdh="http://schemas.microsoft.com/office/word/2020/wordml/sdtdatahash" xmlns:w16sdtfl="http://schemas.microsoft.com/office/word/2024/wordml/sdtformatlock" xmlns:w16se="http://schemas.microsoft.com/office/word/2015/wordml/symex" xmlns:wpg="http://schemas.microsoft.com/office/word/2010/wordprocessingGroup" xmlns:wpi="http://schemas.microsoft.com/office/word/2010/wordprocessingInk" xmlns:wne="http://schemas.microsoft.com/office/word/2006/wordml" xmlns:wps="http://schemas.microsoft.com/office/word/2010/wordprocessingShape" mc:Ignorable="w14 w15 w16se w16cid w16 w16cex w16sdtdh w16sdtfl w16du wp14">
+<w:footnotes xmlns:wpc="http://schemas.microsoft.com/office/word/2010/wordprocessingCanvas" xmlns:cx="http://schemas.microsoft.com/office/drawing/2014/chartex" xmlns:cx1="http://schemas.microsoft.com/office/drawing/2015/9/8/chartex" xmlns:cx2="http://schemas.microsoft.com/office/drawing/2015/10/21/chartex" xmlns:cx3="http://schemas.microsoft.com/office/drawing/2016/5/9/chartex" xmlns:cx4="http://schemas.microsoft.com/office/drawing/2016/5/10/chartex" xmlns:cx5="http://schemas.microsoft.com/office/drawing/2016/5/11/chartex" xmlns:cx6="http://schemas.microsoft.com/office/drawing/2016/5/12/chartex" xmlns:cx7="http://schemas.microsoft.com/office/drawing/2016/5/13/chartex" xmlns:cx8="http://schemas.microsoft.com/office/drawing/2016/5/14/chartex" xmlns:mc="http://schemas.openxmlformats.org/markup-compatibility/2006" xmlns:aink="http://schemas.microsoft.com/office/drawing/2016/ink" xmlns:am3d="http://schemas.microsoft.com/office/drawing/2017/model3d" xmlns:o="urn:schemas-microsoft-com:office:office" xmlns:r="http://schemas.openxmlformats.org/officeDocument/2006/relationships" xmlns:m="http://schemas.openxmlformats.org/officeDocument/2006/math" xmlns:v="urn:schemas-microsoft-com:vml" xmlns:wp14="http://schemas.microsoft.com/office/word/2010/wordprocessingDrawing" xmlns:wp="http://schemas.openxmlformats.org/drawingml/2006/wordprocessingDrawing" xmlns:w10="urn:schemas-microsoft-com:office:word" xmlns:w="http://schemas.openxmlformats.org/wordprocessingml/2006/main" xmlns:w14="http://schemas.microsoft.com/office/word/2010/wordml" xmlns:w15="http://schemas.microsoft.com/office/word/2012/wordml" xmlns:w16cid="http://schemas.microsoft.com/office/word/2016/wordml/cid" xmlns:w16se="http://schemas.microsoft.com/office/word/2015/wordml/symex" xmlns:wpg="http://schemas.microsoft.com/office/word/2010/wordprocessingGroup" xmlns:wpi="http://schemas.microsoft.com/office/word/2010/wordprocessingInk" xmlns:wne="http://schemas.microsoft.com/office/word/2006/wordml" xmlns:wps="http://schemas.microsoft.com/office/word/2010/wordprocessingShape" mc:Ignorable="w14 w15 w16se w16cid wp14">
   <w:footnote w:type="separator" w:id="-1">
     <w:p>
       <w:pPr>
@@ -1781,7 +1906,7 @@
 </file>
 
 <file path=word/numbering.xml><?xml version="1.0" encoding="utf-8"?>
-<w:numbering xmlns:wpc="http://schemas.microsoft.com/office/word/2010/wordprocessingCanvas" xmlns:cx="http://schemas.microsoft.com/office/drawing/2014/chartex" xmlns:cx1="http://schemas.microsoft.com/office/drawing/2015/9/8/chartex" xmlns:cx2="http://schemas.microsoft.com/office/drawing/2015/10/21/chartex" xmlns:cx3="http://schemas.microsoft.com/office/drawing/2016/5/9/chartex" xmlns:cx4="http://schemas.microsoft.com/office/drawing/2016/5/10/chartex" xmlns:cx5="http://schemas.microsoft.com/office/drawing/2016/5/11/chartex" xmlns:cx6="http://schemas.microsoft.com/office/drawing/2016/5/12/chartex" xmlns:cx7="http://schemas.microsoft.com/office/drawing/2016/5/13/chartex" xmlns:cx8="http://schemas.microsoft.com/office/drawing/2016/5/14/chartex" xmlns:mc="http://schemas.openxmlformats.org/markup-compatibility/2006" xmlns:aink="http://schemas.microsoft.com/office/drawing/2016/ink" xmlns:am3d="http://schemas.microsoft.com/office/drawing/2017/model3d" xmlns:o="urn:schemas-microsoft-com:office:office" xmlns:oel="http://schemas.microsoft.com/office/2019/extlst" xmlns:r="http://schemas.openxmlformats.org/officeDocument/2006/relationships" xmlns:m="http://schemas.openxmlformats.org/officeDocument/2006/math" xmlns:v="urn:schemas-microsoft-com:vml" xmlns:wp14="http://schemas.microsoft.com/office/word/2010/wordprocessingDrawing" xmlns:wp="http://schemas.openxmlformats.org/drawingml/2006/wordprocessingDrawing" xmlns:w10="urn:schemas-microsoft-com:office:word" xmlns:w="http://schemas.openxmlformats.org/wordprocessingml/2006/main" xmlns:w14="http://schemas.microsoft.com/office/word/2010/wordml" xmlns:w15="http://schemas.microsoft.com/office/word/2012/wordml" xmlns:w16cex="http://schemas.microsoft.com/office/word/2018/wordml/cex" xmlns:w16cid="http://schemas.microsoft.com/office/word/2016/wordml/cid" xmlns:w16="http://schemas.microsoft.com/office/word/2018/wordml" xmlns:w16du="http://schemas.microsoft.com/office/word/2023/wordml/word16du" xmlns:w16sdtdh="http://schemas.microsoft.com/office/word/2020/wordml/sdtdatahash" xmlns:w16sdtfl="http://schemas.microsoft.com/office/word/2024/wordml/sdtformatlock" xmlns:w16se="http://schemas.microsoft.com/office/word/2015/wordml/symex" xmlns:wpg="http://schemas.microsoft.com/office/word/2010/wordprocessingGroup" xmlns:wpi="http://schemas.microsoft.com/office/word/2010/wordprocessingInk" xmlns:wne="http://schemas.microsoft.com/office/word/2006/wordml" xmlns:wps="http://schemas.microsoft.com/office/word/2010/wordprocessingShape" mc:Ignorable="w14 w15 w16se w16cid w16 w16cex w16sdtdh w16sdtfl w16du wp14">
+<w:numbering xmlns:wpc="http://schemas.microsoft.com/office/word/2010/wordprocessingCanvas" xmlns:cx="http://schemas.microsoft.com/office/drawing/2014/chartex" xmlns:cx1="http://schemas.microsoft.com/office/drawing/2015/9/8/chartex" xmlns:cx2="http://schemas.microsoft.com/office/drawing/2015/10/21/chartex" xmlns:cx3="http://schemas.microsoft.com/office/drawing/2016/5/9/chartex" xmlns:cx4="http://schemas.microsoft.com/office/drawing/2016/5/10/chartex" xmlns:cx5="http://schemas.microsoft.com/office/drawing/2016/5/11/chartex" xmlns:cx6="http://schemas.microsoft.com/office/drawing/2016/5/12/chartex" xmlns:cx7="http://schemas.microsoft.com/office/drawing/2016/5/13/chartex" xmlns:cx8="http://schemas.microsoft.com/office/drawing/2016/5/14/chartex" xmlns:mc="http://schemas.openxmlformats.org/markup-compatibility/2006" xmlns:aink="http://schemas.microsoft.com/office/drawing/2016/ink" xmlns:am3d="http://schemas.microsoft.com/office/drawing/2017/model3d" xmlns:o="urn:schemas-microsoft-com:office:office" xmlns:r="http://schemas.openxmlformats.org/officeDocument/2006/relationships" xmlns:m="http://schemas.openxmlformats.org/officeDocument/2006/math" xmlns:v="urn:schemas-microsoft-com:vml" xmlns:wp14="http://schemas.microsoft.com/office/word/2010/wordprocessingDrawing" xmlns:wp="http://schemas.openxmlformats.org/drawingml/2006/wordprocessingDrawing" xmlns:w10="urn:schemas-microsoft-com:office:word" xmlns:w="http://schemas.openxmlformats.org/wordprocessingml/2006/main" xmlns:w14="http://schemas.microsoft.com/office/word/2010/wordml" xmlns:w15="http://schemas.microsoft.com/office/word/2012/wordml" xmlns:w16cid="http://schemas.microsoft.com/office/word/2016/wordml/cid" xmlns:w16se="http://schemas.microsoft.com/office/word/2015/wordml/symex" xmlns:wpg="http://schemas.microsoft.com/office/word/2010/wordprocessingGroup" xmlns:wpi="http://schemas.microsoft.com/office/word/2010/wordprocessingInk" xmlns:wne="http://schemas.microsoft.com/office/word/2006/wordml" xmlns:wps="http://schemas.microsoft.com/office/word/2010/wordprocessingShape" mc:Ignorable="w14 w15 w16se w16cid wp14">
   <w:abstractNum w:abstractNumId="0" w15:restartNumberingAfterBreak="0">
     <w:nsid w:val="09211870"/>
     <w:multiLevelType w:val="hybridMultilevel"/>
@@ -3025,44 +3150,44 @@
       </w:rPr>
     </w:lvl>
   </w:abstractNum>
-  <w:num w:numId="1" w16cid:durableId="269818825">
+  <w:num w:numId="1">
     <w:abstractNumId w:val="2"/>
   </w:num>
-  <w:num w:numId="2" w16cid:durableId="62022587">
+  <w:num w:numId="2">
     <w:abstractNumId w:val="3"/>
   </w:num>
-  <w:num w:numId="3" w16cid:durableId="1831286440">
+  <w:num w:numId="3">
     <w:abstractNumId w:val="8"/>
   </w:num>
-  <w:num w:numId="4" w16cid:durableId="1266040795">
+  <w:num w:numId="4">
     <w:abstractNumId w:val="1"/>
   </w:num>
-  <w:num w:numId="5" w16cid:durableId="849565031">
+  <w:num w:numId="5">
     <w:abstractNumId w:val="7"/>
   </w:num>
-  <w:num w:numId="6" w16cid:durableId="151458062">
+  <w:num w:numId="6">
     <w:abstractNumId w:val="6"/>
   </w:num>
-  <w:num w:numId="7" w16cid:durableId="66659210">
+  <w:num w:numId="7">
     <w:abstractNumId w:val="0"/>
   </w:num>
-  <w:num w:numId="8" w16cid:durableId="326131083">
+  <w:num w:numId="8">
     <w:abstractNumId w:val="9"/>
   </w:num>
-  <w:num w:numId="9" w16cid:durableId="776172323">
+  <w:num w:numId="9">
     <w:abstractNumId w:val="10"/>
   </w:num>
-  <w:num w:numId="10" w16cid:durableId="1441947325">
+  <w:num w:numId="10">
     <w:abstractNumId w:val="5"/>
   </w:num>
-  <w:num w:numId="11" w16cid:durableId="332340512">
+  <w:num w:numId="11">
     <w:abstractNumId w:val="4"/>
   </w:num>
 </w:numbering>
 </file>
 
 <file path=word/styles.xml><?xml version="1.0" encoding="utf-8"?>
-<w:styles xmlns:mc="http://schemas.openxmlformats.org/markup-compatibility/2006" xmlns:r="http://schemas.openxmlformats.org/officeDocument/2006/relationships" xmlns:w="http://schemas.openxmlformats.org/wordprocessingml/2006/main" xmlns:w14="http://schemas.microsoft.com/office/word/2010/wordml" xmlns:w15="http://schemas.microsoft.com/office/word/2012/wordml" xmlns:w16cex="http://schemas.microsoft.com/office/word/2018/wordml/cex" xmlns:w16cid="http://schemas.microsoft.com/office/word/2016/wordml/cid" xmlns:w16="http://schemas.microsoft.com/office/word/2018/wordml" xmlns:w16du="http://schemas.microsoft.com/office/word/2023/wordml/word16du" xmlns:w16sdtdh="http://schemas.microsoft.com/office/word/2020/wordml/sdtdatahash" xmlns:w16sdtfl="http://schemas.microsoft.com/office/word/2024/wordml/sdtformatlock" xmlns:w16se="http://schemas.microsoft.com/office/word/2015/wordml/symex" mc:Ignorable="w14 w15 w16se w16cid w16 w16cex w16sdtdh w16sdtfl w16du">
+<w:styles xmlns:mc="http://schemas.openxmlformats.org/markup-compatibility/2006" xmlns:r="http://schemas.openxmlformats.org/officeDocument/2006/relationships" xmlns:w="http://schemas.openxmlformats.org/wordprocessingml/2006/main" xmlns:w14="http://schemas.microsoft.com/office/word/2010/wordml" xmlns:w15="http://schemas.microsoft.com/office/word/2012/wordml" xmlns:w16cid="http://schemas.microsoft.com/office/word/2016/wordml/cid" xmlns:w16se="http://schemas.microsoft.com/office/word/2015/wordml/symex" mc:Ignorable="w14 w15 w16se w16cid">
   <w:docDefaults>
     <w:rPrDefault>
       <w:rPr>
@@ -3080,7 +3205,7 @@
       </w:pPr>
     </w:pPrDefault>
   </w:docDefaults>
-  <w:latentStyles w:defLockedState="0" w:defUIPriority="99" w:defSemiHidden="0" w:defUnhideWhenUsed="0" w:defQFormat="0" w:count="376">
+  <w:latentStyles w:defLockedState="0" w:defUIPriority="99" w:defSemiHidden="0" w:defUnhideWhenUsed="0" w:defQFormat="0" w:count="375">
     <w:lsdException w:name="Normal" w:uiPriority="0" w:qFormat="1"/>
     <w:lsdException w:name="heading 1" w:uiPriority="9" w:qFormat="1"/>
     <w:lsdException w:name="heading 2" w:semiHidden="1" w:uiPriority="9" w:unhideWhenUsed="1" w:qFormat="1"/>
@@ -3456,7 +3581,6 @@
     <w:lsdException w:name="Smart Hyperlink" w:semiHidden="1" w:unhideWhenUsed="1"/>
     <w:lsdException w:name="Hashtag" w:semiHidden="1" w:unhideWhenUsed="1"/>
     <w:lsdException w:name="Unresolved Mention" w:semiHidden="1" w:unhideWhenUsed="1"/>
-    <w:lsdException w:name="Smart Link" w:semiHidden="1" w:unhideWhenUsed="1"/>
   </w:latentStyles>
   <w:style w:type="paragraph" w:default="1" w:styleId="Normal">
     <w:name w:val="Normal"/>
@@ -4340,18 +4464,18 @@
 </file>
 
 <file path=customXml/item1.xml><?xml version="1.0" encoding="utf-8"?>
-<p:properties xmlns:p="http://schemas.microsoft.com/office/2006/metadata/properties" xmlns:xsi="http://www.w3.org/2001/XMLSchema-instance" xmlns:pc="http://schemas.microsoft.com/office/infopath/2007/PartnerControls">
-  <documentManagement/>
-</p:properties>
-</file>
-
-<file path=customXml/item2.xml><?xml version="1.0" encoding="utf-8"?>
 <?mso-contentType ?>
 <FormTemplates xmlns="http://schemas.microsoft.com/sharepoint/v3/contenttype/forms">
   <Display>DocumentLibraryForm</Display>
   <Edit>DocumentLibraryForm</Edit>
   <New>DocumentLibraryForm</New>
 </FormTemplates>
+</file>
+
+<file path=customXml/item2.xml><?xml version="1.0" encoding="utf-8"?>
+<p:properties xmlns:p="http://schemas.microsoft.com/office/2006/metadata/properties" xmlns:xsi="http://www.w3.org/2001/XMLSchema-instance" xmlns:pc="http://schemas.microsoft.com/office/infopath/2007/PartnerControls">
+  <documentManagement/>
+</p:properties>
 </file>
 
 <file path=customXml/item3.xml><?xml version="1.0" encoding="utf-8"?>
@@ -4493,18 +4617,18 @@
 </file>
 
 <file path=customXml/itemProps1.xml><?xml version="1.0" encoding="utf-8"?>
-<ds:datastoreItem xmlns:ds="http://schemas.openxmlformats.org/officeDocument/2006/customXml" ds:itemID="{0028EFB7-3706-477C-BC22-76AF0C752638}">
+<ds:datastoreItem xmlns:ds="http://schemas.openxmlformats.org/officeDocument/2006/customXml" ds:itemID="{0876BD9A-9CA5-48C2-BF8E-F2DECFB0FD38}">
   <ds:schemaRefs>
-    <ds:schemaRef ds:uri="http://schemas.microsoft.com/office/2006/metadata/properties"/>
-    <ds:schemaRef ds:uri="http://schemas.microsoft.com/office/infopath/2007/PartnerControls"/>
+    <ds:schemaRef ds:uri="http://schemas.microsoft.com/sharepoint/v3/contenttype/forms"/>
   </ds:schemaRefs>
 </ds:datastoreItem>
 </file>
 
 <file path=customXml/itemProps2.xml><?xml version="1.0" encoding="utf-8"?>
-<ds:datastoreItem xmlns:ds="http://schemas.openxmlformats.org/officeDocument/2006/customXml" ds:itemID="{0876BD9A-9CA5-48C2-BF8E-F2DECFB0FD38}">
+<ds:datastoreItem xmlns:ds="http://schemas.openxmlformats.org/officeDocument/2006/customXml" ds:itemID="{0028EFB7-3706-477C-BC22-76AF0C752638}">
   <ds:schemaRefs>
-    <ds:schemaRef ds:uri="http://schemas.microsoft.com/sharepoint/v3/contenttype/forms"/>
+    <ds:schemaRef ds:uri="http://schemas.microsoft.com/office/2006/metadata/properties"/>
+    <ds:schemaRef ds:uri="http://schemas.microsoft.com/office/infopath/2007/PartnerControls"/>
   </ds:schemaRefs>
 </ds:datastoreItem>
 </file>

</xml_diff>